<commit_message>
ML pesos dinámicos + período unificado + manual v3
</commit_message>
<xml_diff>
--- a/Manual_ACI_Terminal.docx
+++ b/Manual_ACI_Terminal.docx
@@ -1442,7 +1442,7 @@
         <w:pStyle w:val="Heading3"/>
       </w:pPr>
       <w:r>
-        <w:t xml:space="preserve">Range e Interval</w:t>
+        <w:t xml:space="preserve">Período de estudio (un solo control para TODO)</w:t>
       </w:r>
     </w:p>
     <w:p>
@@ -1450,27 +1450,65 @@
         <w:spacing w:after="120" w:line="276"/>
       </w:pPr>
       <w:r>
-        <w:t xml:space="preserve"/>
-      </w:r>
-      <w:r>
-        <w:rPr>
-          <w:b/>
-          <w:bCs/>
-        </w:rPr>
-        <w:t xml:space="preserve">Range:</w:t>
-      </w:r>
-      <w:r>
-        <w:t xml:space="preserve"> ventana temporal (1M, 1Y, 5Y, YTD o fechas a medida). </w:t>
-      </w:r>
-      <w:r>
-        <w:rPr>
-          <w:b/>
-          <w:bCs/>
-        </w:rPr>
-        <w:t xml:space="preserve">Interval:</w:t>
-      </w:r>
-      <w:r>
-        <w:t xml:space="preserve"> granularidad de las velas (1m … 1wk).</w:t>
+        <w:t xml:space="preserve">Un </w:t>
+      </w:r>
+      <w:r>
+        <w:rPr>
+          <w:b/>
+          <w:bCs/>
+        </w:rPr>
+        <w:t xml:space="preserve">selector segmentado</w:t>
+      </w:r>
+      <w:r>
+        <w:t xml:space="preserve"> —1M · 6M · YTD · 1A · 2A · 5A · 10A · MÁX— define la ventana temporal de </w:t>
+      </w:r>
+      <w:r>
+        <w:rPr>
+          <w:b/>
+          <w:bCs/>
+        </w:rPr>
+        <w:t xml:space="preserve">todas</w:t>
+      </w:r>
+      <w:r>
+        <w:t xml:space="preserve"> las pestañas a la vez: Market, Technical, Theory, Portfolio, Risk y Strategy Lab. Antes cada una tenía su propio control; ahora cambiás el período en un solo lugar y se actualiza el tablero entero. </w:t>
+      </w:r>
+      <w:r>
+        <w:rPr>
+          <w:b/>
+          <w:bCs/>
+        </w:rPr>
+        <w:t xml:space="preserve">MÁX</w:t>
+      </w:r>
+      <w:r>
+        <w:t xml:space="preserve"> trae ~30 años (toda la historia disponible). El default es </w:t>
+      </w:r>
+      <w:r>
+        <w:rPr>
+          <w:b/>
+          <w:bCs/>
+        </w:rPr>
+        <w:t xml:space="preserve">5A</w:t>
+      </w:r>
+      <w:r>
+        <w:t xml:space="preserve">.</w:t>
+      </w:r>
+    </w:p>
+    <w:p>
+      <w:pPr>
+        <w:spacing w:after="120" w:line="276"/>
+      </w:pPr>
+      <w:r>
+        <w:t xml:space="preserve">Dentro del desplegable </w:t>
+      </w:r>
+      <w:r>
+        <w:rPr>
+          <w:b/>
+          <w:bCs/>
+        </w:rPr>
+        <w:t xml:space="preserve">“Rango a medida · intervalo de velas”</w:t>
+      </w:r>
+      <w:r>
+        <w:t xml:space="preserve"> podés fijar fechas exactas y elegir la granularidad de las velas (1m … 1wk).</w:t>
       </w:r>
     </w:p>
     <w:p>
@@ -1492,7 +1530,17 @@
         <w:t xml:space="preserve">Tip.</w:t>
       </w:r>
       <w:r>
-        <w:t xml:space="preserve"> Los intervalos intradía (1m, 5m…) solo traen los últimos días por límites de Yahoo. Para historias largas, usá diario (1d) o semanal (1wk).</w:t>
+        <w:t xml:space="preserve"> Los intervalos intradía (1m, 5m…) solo traen los últimos días por límites de Yahoo. Para historias largas, usá diario (1d). Para los </w:t>
+      </w:r>
+      <w:r>
+        <w:rPr>
+          <w:b/>
+          <w:bCs/>
+        </w:rPr>
+        <w:t xml:space="preserve">backtests</w:t>
+      </w:r>
+      <w:r>
+        <w:t xml:space="preserve"> del Strategy Lab conviene 5A o MÁX: con períodos cortos hay pocas operaciones y los resultados no son confiables.</w:t>
       </w:r>
     </w:p>
     <w:p>
@@ -2533,10 +2581,10 @@
     </w:p>
     <w:p>
       <w:pPr>
-        <w:pStyle w:val="Heading1"/>
-      </w:pPr>
-      <w:r>
-        <w:t xml:space="preserve">6. MARKET — Cotizaciones y performance relativa</w:t>
+        <w:pStyle w:val="Heading3"/>
+      </w:pPr>
+      <w:r>
+        <w:t xml:space="preserve">Cómo leer los gráficos</w:t>
       </w:r>
     </w:p>
     <w:p>
@@ -2556,10 +2604,10 @@
           <w:b/>
           <w:bCs/>
         </w:rPr>
-        <w:t xml:space="preserve">Quotes:</w:t>
-      </w:r>
-      <w:r>
-        <w:t xml:space="preserve"> tabla con último, variación %, apertura, máx/mín, volumen y capitalización.</w:t>
+        <w:t xml:space="preserve">Sparklines</w:t>
+      </w:r>
+      <w:r>
+        <w:t xml:space="preserve"> (mini-líneas junto a cada instrumento): la forma del precio del último mes. Verde si terminó arriba de donde empezó, rojo si abajo. Sirven para captar la tendencia de un vistazo, no el nivel exacto.</w:t>
       </w:r>
     </w:p>
     <w:p>
@@ -2579,10 +2627,20 @@
           <w:b/>
           <w:bCs/>
         </w:rPr>
-        <w:t xml:space="preserve">Comparative performance (base 100):</w:t>
-      </w:r>
-      <w:r>
-        <w:t xml:space="preserve"> todas las series llevadas a 100 al inicio. Permite comparar rendimiento relativo sin que la escala de precios distorsione (una acción de $1000 y una de $10 se comparan en igualdad).</w:t>
+        <w:t xml:space="preserve">Curva de Treasuries:</w:t>
+      </w:r>
+      <w:r>
+        <w:t xml:space="preserve"> eje X = plazo del bono (3 meses → 30 años), eje Y = tasa (%). La línea llena es hoy; la punteada, el cierre anterior. Si la curva sube de izquierda a derecha es </w:t>
+      </w:r>
+      <w:r>
+        <w:rPr>
+          <w:b/>
+          <w:bCs/>
+        </w:rPr>
+        <w:t xml:space="preserve">normal</w:t>
+      </w:r>
+      <w:r>
+        <w:t xml:space="preserve">; si baja (invertida) suele anticipar recesión. Que la línea de hoy esté por encima de la de ayer = subieron las tasas.</w:t>
       </w:r>
     </w:p>
     <w:p>
@@ -2602,10 +2660,207 @@
           <w:b/>
           <w:bCs/>
         </w:rPr>
+        <w:t xml:space="preserve">Treemap mundial:</w:t>
+      </w:r>
+      <w:r>
+        <w:t xml:space="preserve"> cada rectángulo es un instrumento; su </w:t>
+      </w:r>
+      <w:r>
+        <w:rPr>
+          <w:b/>
+          <w:bCs/>
+        </w:rPr>
+        <w:t xml:space="preserve">color</w:t>
+      </w:r>
+      <w:r>
+        <w:t xml:space="preserve"> es la variación del día (verde = sube, rojo = baja, más intenso = mayor magnitud). De un vistazo ves si el mundo está “verde” o “rojo” y qué región/activo manda.</w:t>
+      </w:r>
+    </w:p>
+    <w:p>
+      <w:pPr>
+        <w:pStyle w:val="ListParagraph"/>
+        <w:numPr>
+          <w:ilvl w:val="0"/>
+          <w:numId w:val="3"/>
+        </w:numPr>
+        <w:spacing w:after="60" w:line="270"/>
+      </w:pPr>
+      <w:r>
+        <w:t xml:space="preserve"/>
+      </w:r>
+      <w:r>
+        <w:rPr>
+          <w:b/>
+          <w:bCs/>
+        </w:rPr>
+        <w:t xml:space="preserve">Top movers:</w:t>
+      </w:r>
+      <w:r>
+        <w:t xml:space="preserve"> barras horizontales ordenadas — los que más subieron arriba en verde, los que más cayeron abajo en rojo. El largo de la barra = magnitud del movimiento.</w:t>
+      </w:r>
+    </w:p>
+    <w:p>
+      <w:pPr>
+        <w:pStyle w:val="ListParagraph"/>
+        <w:numPr>
+          <w:ilvl w:val="0"/>
+          <w:numId w:val="3"/>
+        </w:numPr>
+        <w:spacing w:after="60" w:line="270"/>
+      </w:pPr>
+      <w:r>
+        <w:t xml:space="preserve"/>
+      </w:r>
+      <w:r>
+        <w:rPr>
+          <w:b/>
+          <w:bCs/>
+        </w:rPr>
+        <w:t xml:space="preserve">Relojes de plazas:</w:t>
+      </w:r>
+      <w:r>
+        <w:t xml:space="preserve"> un punto verde = bolsa abierta ahora, gris/rojo = cerrada. Útil para saber qué mercado está marcando precio en este momento.</w:t>
+      </w:r>
+    </w:p>
+    <w:p>
+      <w:pPr>
+        <w:pStyle w:val="Heading1"/>
+      </w:pPr>
+      <w:r>
+        <w:t xml:space="preserve">6. MARKET — Cotizaciones y performance relativa</w:t>
+      </w:r>
+    </w:p>
+    <w:p>
+      <w:pPr>
+        <w:pStyle w:val="ListParagraph"/>
+        <w:numPr>
+          <w:ilvl w:val="0"/>
+          <w:numId w:val="3"/>
+        </w:numPr>
+        <w:spacing w:after="60" w:line="270"/>
+      </w:pPr>
+      <w:r>
+        <w:t xml:space="preserve"/>
+      </w:r>
+      <w:r>
+        <w:rPr>
+          <w:b/>
+          <w:bCs/>
+        </w:rPr>
+        <w:t xml:space="preserve">Quotes:</w:t>
+      </w:r>
+      <w:r>
+        <w:t xml:space="preserve"> tabla con último, variación %, apertura, máx/mín, volumen y capitalización.</w:t>
+      </w:r>
+    </w:p>
+    <w:p>
+      <w:pPr>
+        <w:pStyle w:val="ListParagraph"/>
+        <w:numPr>
+          <w:ilvl w:val="0"/>
+          <w:numId w:val="3"/>
+        </w:numPr>
+        <w:spacing w:after="60" w:line="270"/>
+      </w:pPr>
+      <w:r>
+        <w:t xml:space="preserve"/>
+      </w:r>
+      <w:r>
+        <w:rPr>
+          <w:b/>
+          <w:bCs/>
+        </w:rPr>
+        <w:t xml:space="preserve">Comparative performance (base 100):</w:t>
+      </w:r>
+      <w:r>
+        <w:t xml:space="preserve"> todas las series llevadas a 100 al inicio. Permite comparar rendimiento relativo sin que la escala de precios distorsione (una acción de $1000 y una de $10 se comparan en igualdad).</w:t>
+      </w:r>
+    </w:p>
+    <w:p>
+      <w:pPr>
+        <w:pStyle w:val="ListParagraph"/>
+        <w:numPr>
+          <w:ilvl w:val="0"/>
+          <w:numId w:val="3"/>
+        </w:numPr>
+        <w:spacing w:after="60" w:line="270"/>
+      </w:pPr>
+      <w:r>
+        <w:t xml:space="preserve"/>
+      </w:r>
+      <w:r>
+        <w:rPr>
+          <w:b/>
+          <w:bCs/>
+        </w:rPr>
         <w:t xml:space="preserve">Daily heatmap:</w:t>
       </w:r>
       <w:r>
         <w:t xml:space="preserve"> barras de variación % del día, verde si sube, rojo si baja.</w:t>
+      </w:r>
+    </w:p>
+    <w:p>
+      <w:pPr>
+        <w:pStyle w:val="Heading3"/>
+      </w:pPr>
+      <w:r>
+        <w:t xml:space="preserve">Cómo leer los gráficos</w:t>
+      </w:r>
+    </w:p>
+    <w:p>
+      <w:pPr>
+        <w:pStyle w:val="ListParagraph"/>
+        <w:numPr>
+          <w:ilvl w:val="0"/>
+          <w:numId w:val="3"/>
+        </w:numPr>
+        <w:spacing w:after="60" w:line="270"/>
+      </w:pPr>
+      <w:r>
+        <w:t xml:space="preserve"/>
+      </w:r>
+      <w:r>
+        <w:rPr>
+          <w:b/>
+          <w:bCs/>
+        </w:rPr>
+        <w:t xml:space="preserve">Performance base 100:</w:t>
+      </w:r>
+      <w:r>
+        <w:t xml:space="preserve"> eje Y = valor de cada activo si hubieras invertido 100 al inicio del período. Es el gráfico clave para </w:t>
+      </w:r>
+      <w:r>
+        <w:rPr>
+          <w:b/>
+          <w:bCs/>
+        </w:rPr>
+        <w:t xml:space="preserve">comparar</w:t>
+      </w:r>
+      <w:r>
+        <w:t xml:space="preserve">: la línea más alta al final es la que más rindió, sin importar el precio nominal de cada acción. El cruce de dos líneas marca el momento en que una pasó a la otra.</w:t>
+      </w:r>
+    </w:p>
+    <w:p>
+      <w:pPr>
+        <w:pStyle w:val="ListParagraph"/>
+        <w:numPr>
+          <w:ilvl w:val="0"/>
+          <w:numId w:val="3"/>
+        </w:numPr>
+        <w:spacing w:after="60" w:line="270"/>
+      </w:pPr>
+      <w:r>
+        <w:t xml:space="preserve"/>
+      </w:r>
+      <w:r>
+        <w:rPr>
+          <w:b/>
+          <w:bCs/>
+        </w:rPr>
+        <w:t xml:space="preserve">Daily heatmap:</w:t>
+      </w:r>
+      <w:r>
+        <w:t xml:space="preserve"> una sola barra por ticker con su % del día. Lo verde a la izquierda (mayor suba), lo rojo a la derecha (mayor caída). Sirve para ver, hoy, quién lideró y quién quedó rezagado dentro de tu watchlist.</w:t>
       </w:r>
     </w:p>
     <w:p>
@@ -5904,6 +6159,199 @@
     </w:tbl>
     <w:p>
       <w:pPr>
+        <w:pStyle w:val="Heading2"/>
+      </w:pPr>
+      <w:r>
+        <w:t xml:space="preserve">7.8 Cómo leer los gráficos</w:t>
+      </w:r>
+    </w:p>
+    <w:p>
+      <w:pPr>
+        <w:pStyle w:val="ListParagraph"/>
+        <w:numPr>
+          <w:ilvl w:val="0"/>
+          <w:numId w:val="3"/>
+        </w:numPr>
+        <w:spacing w:after="60" w:line="270"/>
+      </w:pPr>
+      <w:r>
+        <w:t xml:space="preserve"/>
+      </w:r>
+      <w:r>
+        <w:rPr>
+          <w:b/>
+          <w:bCs/>
+        </w:rPr>
+        <w:t xml:space="preserve">Velas (candlestick):</w:t>
+      </w:r>
+      <w:r>
+        <w:t xml:space="preserve"> cada vela es un día. Cuerpo </w:t>
+      </w:r>
+      <w:r>
+        <w:rPr>
+          <w:b/>
+          <w:bCs/>
+        </w:rPr>
+        <w:t xml:space="preserve">verde</w:t>
+      </w:r>
+      <w:r>
+        <w:t xml:space="preserve"> = cerró arriba de donde abrió (alcista); </w:t>
+      </w:r>
+      <w:r>
+        <w:rPr>
+          <w:b/>
+          <w:bCs/>
+        </w:rPr>
+        <w:t xml:space="preserve">rojo</w:t>
+      </w:r>
+      <w:r>
+        <w:t xml:space="preserve"> = cerró abajo (bajista). Las mechas marcan el máximo y mínimo del día. Cuerpos largos = movimiento decidido; cuerpos chicos con mechas largas = indecisión.</w:t>
+      </w:r>
+    </w:p>
+    <w:p>
+      <w:pPr>
+        <w:pStyle w:val="ListParagraph"/>
+        <w:numPr>
+          <w:ilvl w:val="0"/>
+          <w:numId w:val="3"/>
+        </w:numPr>
+        <w:spacing w:after="60" w:line="270"/>
+      </w:pPr>
+      <w:r>
+        <w:t xml:space="preserve"/>
+      </w:r>
+      <w:r>
+        <w:rPr>
+          <w:b/>
+          <w:bCs/>
+        </w:rPr>
+        <w:t xml:space="preserve">Overlays (Bollinger, Keltner, Auto-Regresión):</w:t>
+      </w:r>
+      <w:r>
+        <w:t xml:space="preserve"> se dibujan ENCIMA de las velas como un “canal”. La idea: el precio pasa ~95% del tiempo dentro de las bandas. Tocar la banda superior sugiere sobrecompra; la inferior, sobreventa. Bandas que se </w:t>
+      </w:r>
+      <w:r>
+        <w:rPr>
+          <w:b/>
+          <w:bCs/>
+        </w:rPr>
+        <w:t xml:space="preserve">estrechan</w:t>
+      </w:r>
+      <w:r>
+        <w:t xml:space="preserve"> anticipan un movimiento fuerte; una </w:t>
+      </w:r>
+      <w:r>
+        <w:rPr>
+          <w:b/>
+          <w:bCs/>
+        </w:rPr>
+        <w:t xml:space="preserve">ruptura</w:t>
+      </w:r>
+      <w:r>
+        <w:t xml:space="preserve"> clara de la banda suele continuar en esa dirección.</w:t>
+      </w:r>
+    </w:p>
+    <w:p>
+      <w:pPr>
+        <w:pStyle w:val="ListParagraph"/>
+        <w:numPr>
+          <w:ilvl w:val="0"/>
+          <w:numId w:val="3"/>
+        </w:numPr>
+        <w:spacing w:after="60" w:line="270"/>
+      </w:pPr>
+      <w:r>
+        <w:t xml:space="preserve"/>
+      </w:r>
+      <w:r>
+        <w:rPr>
+          <w:b/>
+          <w:bCs/>
+        </w:rPr>
+        <w:t xml:space="preserve">Osciladores (RSI, MACD, CCI, Estocástico…):</w:t>
+      </w:r>
+      <w:r>
+        <w:t xml:space="preserve"> van en un </w:t>
+      </w:r>
+      <w:r>
+        <w:rPr>
+          <w:b/>
+          <w:bCs/>
+        </w:rPr>
+        <w:t xml:space="preserve">panel debajo</w:t>
+      </w:r>
+      <w:r>
+        <w:t xml:space="preserve"> del precio, con líneas de umbral punteadas (ej. 70/30 en RSI). Cuando la línea entra en la zona alta = sobrecompra; en la baja = sobreventa. En MACD, el cruce de la línea con su señal (y el histograma cruzando el cero) marca el cambio de momentum.</w:t>
+      </w:r>
+    </w:p>
+    <w:p>
+      <w:pPr>
+        <w:pStyle w:val="ListParagraph"/>
+        <w:numPr>
+          <w:ilvl w:val="0"/>
+          <w:numId w:val="3"/>
+        </w:numPr>
+        <w:spacing w:after="60" w:line="270"/>
+      </w:pPr>
+      <w:r>
+        <w:t xml:space="preserve"/>
+      </w:r>
+      <w:r>
+        <w:rPr>
+          <w:b/>
+          <w:bCs/>
+        </w:rPr>
+        <w:t xml:space="preserve">Divergencia (lo más valioso):</w:t>
+      </w:r>
+      <w:r>
+        <w:t xml:space="preserve"> mirá si el precio y el oscilador van para el mismo lado. Si el precio hace un máximo más alto pero el oscilador hace uno más bajo, es </w:t>
+      </w:r>
+      <w:r>
+        <w:rPr>
+          <w:b/>
+          <w:bCs/>
+        </w:rPr>
+        <w:t xml:space="preserve">divergencia bajista</w:t>
+      </w:r>
+      <w:r>
+        <w:t xml:space="preserve"> (la suba se está quedando sin fuerza). Al revés, divergencia alcista.</w:t>
+      </w:r>
+    </w:p>
+    <w:p>
+      <w:pPr>
+        <w:pStyle w:val="ListParagraph"/>
+        <w:numPr>
+          <w:ilvl w:val="0"/>
+          <w:numId w:val="3"/>
+        </w:numPr>
+        <w:spacing w:after="60" w:line="270"/>
+      </w:pPr>
+      <w:r>
+        <w:t xml:space="preserve"/>
+      </w:r>
+      <w:r>
+        <w:rPr>
+          <w:b/>
+          <w:bCs/>
+        </w:rPr>
+        <w:t xml:space="preserve">Elliott:</w:t>
+      </w:r>
+      <w:r>
+        <w:t xml:space="preserve"> la línea suavizada muestra la estructura de fondo y los puntos etiquetados son los pivotes (1-2-3-4-5 / A-B-C). Una etiqueta con </w:t>
+      </w:r>
+      <w:r>
+        <w:rPr>
+          <w:b/>
+          <w:bCs/>
+        </w:rPr>
+        <w:t xml:space="preserve">“?”</w:t>
+      </w:r>
+      <w:r>
+        <w:t xml:space="preserve"> = ese pivote viola una regla → el conteo es dudoso. El resumen abajo te dice en qué onda estás y cuál sería la siguiente.</w:t>
+      </w:r>
+    </w:p>
+    <w:p>
+      <w:pPr>
         <w:pStyle w:val="Heading1"/>
       </w:pPr>
       <w:r>
@@ -7486,6 +7934,72 @@
     </w:p>
     <w:p>
       <w:pPr>
+        <w:pStyle w:val="Heading3"/>
+      </w:pPr>
+      <w:r>
+        <w:t xml:space="preserve">Cómo leer las tablas</w:t>
+      </w:r>
+    </w:p>
+    <w:p>
+      <w:pPr>
+        <w:spacing w:after="120" w:line="276"/>
+      </w:pPr>
+      <w:r>
+        <w:t xml:space="preserve">Esta pestaña no tiene gráficos: muestra </w:t>
+      </w:r>
+      <w:r>
+        <w:rPr>
+          <w:b/>
+          <w:bCs/>
+        </w:rPr>
+        <w:t xml:space="preserve">tablas</w:t>
+      </w:r>
+      <w:r>
+        <w:t xml:space="preserve">. En </w:t>
+      </w:r>
+      <w:r>
+        <w:rPr>
+          <w:b/>
+          <w:bCs/>
+        </w:rPr>
+        <w:t xml:space="preserve">Ratios TTM</w:t>
+      </w:r>
+      <w:r>
+        <w:t xml:space="preserve">, cada columna es un ticker y cada fila un múltiplo — leelas </w:t>
+      </w:r>
+      <w:r>
+        <w:rPr>
+          <w:b/>
+          <w:bCs/>
+        </w:rPr>
+        <w:t xml:space="preserve">comparando en horizontal</w:t>
+      </w:r>
+      <w:r>
+        <w:t xml:space="preserve"> entre empresas del mismo sector (un P/E de 35 dice poco solo; dice mucho frente a un peer en 18). En </w:t>
+      </w:r>
+      <w:r>
+        <w:rPr>
+          <w:b/>
+          <w:bCs/>
+        </w:rPr>
+        <w:t xml:space="preserve">Statements</w:t>
+      </w:r>
+      <w:r>
+        <w:t xml:space="preserve">, cada fila es un ticker y las columnas son las líneas del estado contable del último período; mirá la </w:t>
+      </w:r>
+      <w:r>
+        <w:rPr>
+          <w:b/>
+          <w:bCs/>
+        </w:rPr>
+        <w:t xml:space="preserve">coherencia</w:t>
+      </w:r>
+      <w:r>
+        <w:t xml:space="preserve"> (ej. que el CFO acompañe al Net Income) más que el número aislado.</w:t>
+      </w:r>
+    </w:p>
+    <w:p>
+      <w:pPr>
         <w:pStyle w:val="Heading1"/>
       </w:pPr>
       <w:r>
@@ -8586,18 +9100,10 @@
     </w:p>
     <w:p>
       <w:pPr>
-        <w:pStyle w:val="Heading1"/>
-      </w:pPr>
-      <w:r>
-        <w:t xml:space="preserve">10. PORTFOLIO — Constructor de cartera</w:t>
-      </w:r>
-    </w:p>
-    <w:p>
-      <w:pPr>
-        <w:spacing w:after="120" w:line="276"/>
-      </w:pPr>
-      <w:r>
-        <w:t xml:space="preserve">Arma una cartera con la watchlist y evalúa su comportamiento histórico.</w:t>
+        <w:pStyle w:val="Heading2"/>
+      </w:pPr>
+      <w:r>
+        <w:t xml:space="preserve">9.5 Cómo leer los gráficos</w:t>
       </w:r>
     </w:p>
     <w:p>
@@ -8617,10 +9123,30 @@
           <w:b/>
           <w:bCs/>
         </w:rPr>
-        <w:t xml:space="preserve">Weights:</w:t>
-      </w:r>
-      <w:r>
-        <w:t xml:space="preserve"> peso (%) de cada activo; si no suman 100%, se normalizan.</w:t>
+        <w:t xml:space="preserve">Heatmap de correlación:</w:t>
+      </w:r>
+      <w:r>
+        <w:t xml:space="preserve"> una grilla activo × activo coloreada de −1 a +1. </w:t>
+      </w:r>
+      <w:r>
+        <w:rPr>
+          <w:b/>
+          <w:bCs/>
+        </w:rPr>
+        <w:t xml:space="preserve">Verde/frío</w:t>
+      </w:r>
+      <w:r>
+        <w:t xml:space="preserve"> = correlación baja o negativa (bueno: diversifica); </w:t>
+      </w:r>
+      <w:r>
+        <w:rPr>
+          <w:b/>
+          <w:bCs/>
+        </w:rPr>
+        <w:t xml:space="preserve">rojo/cálido</w:t>
+      </w:r>
+      <w:r>
+        <w:t xml:space="preserve"> = alta (malo: se mueven juntos, no protege). La diagonal siempre es 1. Buscá pares fríos para diversificar.</w:t>
       </w:r>
     </w:p>
     <w:p>
@@ -8640,10 +9166,50 @@
           <w:b/>
           <w:bCs/>
         </w:rPr>
-        <w:t xml:space="preserve">KPIs:</w:t>
-      </w:r>
-      <w:r>
-        <w:t xml:space="preserve"> retorno total, volatilidad anualizada, Sharpe (R_f=0) y máximo drawdown.</w:t>
+        <w:t xml:space="preserve">Frontera eficiente:</w:t>
+      </w:r>
+      <w:r>
+        <w:t xml:space="preserve"> eje X = riesgo (volatilidad σ), eje Y = retorno esperado. La </w:t>
+      </w:r>
+      <w:r>
+        <w:rPr>
+          <w:b/>
+          <w:bCs/>
+        </w:rPr>
+        <w:t xml:space="preserve">nube de puntos</w:t>
+      </w:r>
+      <w:r>
+        <w:t xml:space="preserve"> son carteras posibles (Monte Carlo); el </w:t>
+      </w:r>
+      <w:r>
+        <w:rPr>
+          <w:b/>
+          <w:bCs/>
+        </w:rPr>
+        <w:t xml:space="preserve">borde superior izquierdo</w:t>
+      </w:r>
+      <w:r>
+        <w:t xml:space="preserve"> es la frontera (lo mejor alcanzable). Querés estar lo más </w:t>
+      </w:r>
+      <w:r>
+        <w:rPr>
+          <w:b/>
+          <w:bCs/>
+        </w:rPr>
+        <w:t xml:space="preserve">arriba y a la izquierda</w:t>
+      </w:r>
+      <w:r>
+        <w:t xml:space="preserve"> posible. El punto destacado de máximo Sharpe es la </w:t>
+      </w:r>
+      <w:r>
+        <w:rPr>
+          <w:b/>
+          <w:bCs/>
+        </w:rPr>
+        <w:t xml:space="preserve">cartera tangente</w:t>
+      </w:r>
+      <w:r>
+        <w:t xml:space="preserve">.</w:t>
       </w:r>
     </w:p>
     <w:p>
@@ -8663,10 +9229,40 @@
           <w:b/>
           <w:bCs/>
         </w:rPr>
-        <w:t xml:space="preserve">Equity curve:</w:t>
-      </w:r>
-      <w:r>
-        <w:t xml:space="preserve"> valor acumulado vs. un benchmark equiponderado.</w:t>
+        <w:t xml:space="preserve">CML / SML:</w:t>
+      </w:r>
+      <w:r>
+        <w:t xml:space="preserve"> una recta que arranca en la tasa libre de riesgo. En la </w:t>
+      </w:r>
+      <w:r>
+        <w:rPr>
+          <w:b/>
+          <w:bCs/>
+        </w:rPr>
+        <w:t xml:space="preserve">SML</w:t>
+      </w:r>
+      <w:r>
+        <w:t xml:space="preserve"> el eje X es la beta (β): los puntos POR ENCIMA de la recta tuvieron </w:t>
+      </w:r>
+      <w:r>
+        <w:rPr>
+          <w:b/>
+          <w:bCs/>
+        </w:rPr>
+        <w:t xml:space="preserve">alpha positivo</w:t>
+      </w:r>
+      <w:r>
+        <w:t xml:space="preserve"> (rindieron más de lo que su riesgo exigía, en verde); por debajo, alpha negativo (rojo). En la </w:t>
+      </w:r>
+      <w:r>
+        <w:rPr>
+          <w:b/>
+          <w:bCs/>
+        </w:rPr>
+        <w:t xml:space="preserve">CML</w:t>
+      </w:r>
+      <w:r>
+        <w:t xml:space="preserve"> el eje X es la volatilidad total y su pendiente es el Sharpe del mercado.</w:t>
       </w:r>
     </w:p>
     <w:p>
@@ -8686,20 +9282,36 @@
           <w:b/>
           <w:bCs/>
         </w:rPr>
-        <w:t xml:space="preserve">Allocation (torta)</w:t>
-      </w:r>
-      <w:r>
-        <w:t xml:space="preserve"> y </w:t>
-      </w:r>
-      <w:r>
-        <w:rPr>
-          <w:b/>
-          <w:bCs/>
-        </w:rPr>
-        <w:t xml:space="preserve">Correlation (heatmap)</w:t>
-      </w:r>
-      <w:r>
-        <w:t xml:space="preserve"> entre los activos.</w:t>
+        <w:t xml:space="preserve">Contribución al riesgo:</w:t>
+      </w:r>
+      <w:r>
+        <w:t xml:space="preserve"> barras que reparten el 100% del riesgo de la cartera entre los activos. Un activo puede tener poco peso pero </w:t>
+      </w:r>
+      <w:r>
+        <w:rPr>
+          <w:b/>
+          <w:bCs/>
+        </w:rPr>
+        <w:t xml:space="preserve">aportar mucho riesgo</w:t>
+      </w:r>
+      <w:r>
+        <w:t xml:space="preserve"> si es muy volátil — esta barra lo revela (no es lo mismo que la torta de pesos).</w:t>
+      </w:r>
+    </w:p>
+    <w:p>
+      <w:pPr>
+        <w:pStyle w:val="Heading1"/>
+      </w:pPr>
+      <w:r>
+        <w:t xml:space="preserve">10. PORTFOLIO — Constructor de cartera</w:t>
+      </w:r>
+    </w:p>
+    <w:p>
+      <w:pPr>
+        <w:spacing w:after="120" w:line="276"/>
+      </w:pPr>
+      <w:r>
+        <w:t xml:space="preserve">Arma una cartera con la watchlist y evalúa su comportamiento histórico.</w:t>
       </w:r>
     </w:p>
     <w:p>
@@ -8719,10 +9331,222 @@
           <w:b/>
           <w:bCs/>
         </w:rPr>
+        <w:t xml:space="preserve">Weights:</w:t>
+      </w:r>
+      <w:r>
+        <w:t xml:space="preserve"> peso (%) de cada activo; si no suman 100%, se normalizan.</w:t>
+      </w:r>
+    </w:p>
+    <w:p>
+      <w:pPr>
+        <w:pStyle w:val="ListParagraph"/>
+        <w:numPr>
+          <w:ilvl w:val="0"/>
+          <w:numId w:val="3"/>
+        </w:numPr>
+        <w:spacing w:after="60" w:line="270"/>
+      </w:pPr>
+      <w:r>
+        <w:t xml:space="preserve"/>
+      </w:r>
+      <w:r>
+        <w:rPr>
+          <w:b/>
+          <w:bCs/>
+        </w:rPr>
+        <w:t xml:space="preserve">KPIs:</w:t>
+      </w:r>
+      <w:r>
+        <w:t xml:space="preserve"> retorno total, volatilidad anualizada, Sharpe (R_f=0) y máximo drawdown.</w:t>
+      </w:r>
+    </w:p>
+    <w:p>
+      <w:pPr>
+        <w:pStyle w:val="ListParagraph"/>
+        <w:numPr>
+          <w:ilvl w:val="0"/>
+          <w:numId w:val="3"/>
+        </w:numPr>
+        <w:spacing w:after="60" w:line="270"/>
+      </w:pPr>
+      <w:r>
+        <w:t xml:space="preserve"/>
+      </w:r>
+      <w:r>
+        <w:rPr>
+          <w:b/>
+          <w:bCs/>
+        </w:rPr>
+        <w:t xml:space="preserve">Equity curve:</w:t>
+      </w:r>
+      <w:r>
+        <w:t xml:space="preserve"> valor acumulado vs. un benchmark equiponderado.</w:t>
+      </w:r>
+    </w:p>
+    <w:p>
+      <w:pPr>
+        <w:pStyle w:val="ListParagraph"/>
+        <w:numPr>
+          <w:ilvl w:val="0"/>
+          <w:numId w:val="3"/>
+        </w:numPr>
+        <w:spacing w:after="60" w:line="270"/>
+      </w:pPr>
+      <w:r>
+        <w:t xml:space="preserve"/>
+      </w:r>
+      <w:r>
+        <w:rPr>
+          <w:b/>
+          <w:bCs/>
+        </w:rPr>
+        <w:t xml:space="preserve">Allocation (torta)</w:t>
+      </w:r>
+      <w:r>
+        <w:t xml:space="preserve"> y </w:t>
+      </w:r>
+      <w:r>
+        <w:rPr>
+          <w:b/>
+          <w:bCs/>
+        </w:rPr>
+        <w:t xml:space="preserve">Correlation (heatmap)</w:t>
+      </w:r>
+      <w:r>
+        <w:t xml:space="preserve"> entre los activos.</w:t>
+      </w:r>
+    </w:p>
+    <w:p>
+      <w:pPr>
+        <w:pStyle w:val="ListParagraph"/>
+        <w:numPr>
+          <w:ilvl w:val="0"/>
+          <w:numId w:val="3"/>
+        </w:numPr>
+        <w:spacing w:after="60" w:line="270"/>
+      </w:pPr>
+      <w:r>
+        <w:t xml:space="preserve"/>
+      </w:r>
+      <w:r>
+        <w:rPr>
+          <w:b/>
+          <w:bCs/>
+        </w:rPr>
         <w:t xml:space="preserve">Drawdown:</w:t>
       </w:r>
       <w:r>
         <w:t xml:space="preserve"> caída desde el máximo previo — el “dolor” máximo que habría sufrido el inversor.</w:t>
+      </w:r>
+    </w:p>
+    <w:p>
+      <w:pPr>
+        <w:pStyle w:val="Heading3"/>
+      </w:pPr>
+      <w:r>
+        <w:t xml:space="preserve">Cómo leer los gráficos</w:t>
+      </w:r>
+    </w:p>
+    <w:p>
+      <w:pPr>
+        <w:pStyle w:val="ListParagraph"/>
+        <w:numPr>
+          <w:ilvl w:val="0"/>
+          <w:numId w:val="3"/>
+        </w:numPr>
+        <w:spacing w:after="60" w:line="270"/>
+      </w:pPr>
+      <w:r>
+        <w:t xml:space="preserve"/>
+      </w:r>
+      <w:r>
+        <w:rPr>
+          <w:b/>
+          <w:bCs/>
+        </w:rPr>
+        <w:t xml:space="preserve">Equity curve:</w:t>
+      </w:r>
+      <w:r>
+        <w:t xml:space="preserve"> valor acumulado de tu cartera vs. el benchmark equiponderado. Si tu línea queda por encima, le ganaste al benchmark; el ángulo (pendiente) es la velocidad de crecimiento, y los pozos son las caídas.</w:t>
+      </w:r>
+    </w:p>
+    <w:p>
+      <w:pPr>
+        <w:pStyle w:val="ListParagraph"/>
+        <w:numPr>
+          <w:ilvl w:val="0"/>
+          <w:numId w:val="3"/>
+        </w:numPr>
+        <w:spacing w:after="60" w:line="270"/>
+      </w:pPr>
+      <w:r>
+        <w:t xml:space="preserve"/>
+      </w:r>
+      <w:r>
+        <w:rPr>
+          <w:b/>
+          <w:bCs/>
+        </w:rPr>
+        <w:t xml:space="preserve">Allocation (torta):</w:t>
+      </w:r>
+      <w:r>
+        <w:t xml:space="preserve"> simplemente cómo repartiste los pesos hoy.</w:t>
+      </w:r>
+    </w:p>
+    <w:p>
+      <w:pPr>
+        <w:pStyle w:val="ListParagraph"/>
+        <w:numPr>
+          <w:ilvl w:val="0"/>
+          <w:numId w:val="3"/>
+        </w:numPr>
+        <w:spacing w:after="60" w:line="270"/>
+      </w:pPr>
+      <w:r>
+        <w:t xml:space="preserve"/>
+      </w:r>
+      <w:r>
+        <w:rPr>
+          <w:b/>
+          <w:bCs/>
+        </w:rPr>
+        <w:t xml:space="preserve">Correlation (heatmap):</w:t>
+      </w:r>
+      <w:r>
+        <w:t xml:space="preserve"> igual que en THEORY — verde (frío) = bueno para diversificar, rojo = se mueven juntos.</w:t>
+      </w:r>
+    </w:p>
+    <w:p>
+      <w:pPr>
+        <w:pStyle w:val="ListParagraph"/>
+        <w:numPr>
+          <w:ilvl w:val="0"/>
+          <w:numId w:val="3"/>
+        </w:numPr>
+        <w:spacing w:after="60" w:line="270"/>
+      </w:pPr>
+      <w:r>
+        <w:t xml:space="preserve"/>
+      </w:r>
+      <w:r>
+        <w:rPr>
+          <w:b/>
+          <w:bCs/>
+        </w:rPr>
+        <w:t xml:space="preserve">Drawdown (área bajo cero):</w:t>
+      </w:r>
+      <w:r>
+        <w:t xml:space="preserve"> el eje Y es siempre ≤ 0; cada pozo es una caída desde el último máximo y su profundidad es cuánto perdiste en ese momento. El pozo más profundo es el </w:t>
+      </w:r>
+      <w:r>
+        <w:rPr>
+          <w:b/>
+          <w:bCs/>
+        </w:rPr>
+        <w:t xml:space="preserve">Max Drawdown</w:t>
+      </w:r>
+      <w:r>
+        <w:t xml:space="preserve">. Cuanto más anchos y profundos los pozos, más doloroso (y largo) fue recuperar.</w:t>
       </w:r>
     </w:p>
     <w:p>
@@ -10119,6 +10943,144 @@
     </w:p>
     <w:p>
       <w:pPr>
+        <w:pStyle w:val="Heading2"/>
+      </w:pPr>
+      <w:r>
+        <w:t xml:space="preserve">11.6 Cómo leer los gráficos</w:t>
+      </w:r>
+    </w:p>
+    <w:p>
+      <w:pPr>
+        <w:spacing w:after="120" w:line="276"/>
+      </w:pPr>
+      <w:r>
+        <w:t xml:space="preserve">La </w:t>
+      </w:r>
+      <w:r>
+        <w:rPr>
+          <w:b/>
+          <w:bCs/>
+        </w:rPr>
+        <w:t xml:space="preserve">historia</w:t>
+      </w:r>
+      <w:r>
+        <w:t xml:space="preserve"> que usa el VaR sale del período global del sidebar (5A por defecto); acá solo elegís la cartera, la confianza, el capital y el horizonte de tenencia.</w:t>
+      </w:r>
+    </w:p>
+    <w:p>
+      <w:pPr>
+        <w:pStyle w:val="ListParagraph"/>
+        <w:numPr>
+          <w:ilvl w:val="0"/>
+          <w:numId w:val="3"/>
+        </w:numPr>
+        <w:spacing w:after="60" w:line="270"/>
+      </w:pPr>
+      <w:r>
+        <w:t xml:space="preserve"/>
+      </w:r>
+      <w:r>
+        <w:rPr>
+          <w:b/>
+          <w:bCs/>
+        </w:rPr>
+        <w:t xml:space="preserve">Tarjetas de VaR/CVaR:</w:t>
+      </w:r>
+      <w:r>
+        <w:t xml:space="preserve"> una por método (paramétrico, histórico, Monte Carlo). El VaR es el umbral de pérdida; el CVaR (debajo) es cuánto perdés si se cruza ese umbral. Compará los tres: si el histórico es bastante más alto, hay colas gordas.</w:t>
+      </w:r>
+    </w:p>
+    <w:p>
+      <w:pPr>
+        <w:pStyle w:val="ListParagraph"/>
+        <w:numPr>
+          <w:ilvl w:val="0"/>
+          <w:numId w:val="3"/>
+        </w:numPr>
+        <w:spacing w:after="60" w:line="270"/>
+      </w:pPr>
+      <w:r>
+        <w:t xml:space="preserve"/>
+      </w:r>
+      <w:r>
+        <w:rPr>
+          <w:b/>
+          <w:bCs/>
+        </w:rPr>
+        <w:t xml:space="preserve">Distribución de retornos:</w:t>
+      </w:r>
+      <w:r>
+        <w:t xml:space="preserve"> el histograma son los retornos reales de la cartera; la curva suave encima es la normal teórica del método paramétrico. La </w:t>
+      </w:r>
+      <w:r>
+        <w:rPr>
+          <w:b/>
+          <w:bCs/>
+        </w:rPr>
+        <w:t xml:space="preserve">zona sombreada a la izquierda</w:t>
+      </w:r>
+      <w:r>
+        <w:t xml:space="preserve"> es la cola de riesgo (el peor (1−α)%), y las líneas verticales marcan dónde cae el VaR de cada método. Si la cola real (barras) se extiende más a la izquierda que la curva normal, el modelo normal </w:t>
+      </w:r>
+      <w:r>
+        <w:rPr>
+          <w:b/>
+          <w:bCs/>
+        </w:rPr>
+        <w:t xml:space="preserve">subestima</w:t>
+      </w:r>
+      <w:r>
+        <w:t xml:space="preserve"> el riesgo.</w:t>
+      </w:r>
+    </w:p>
+    <w:p>
+      <w:pPr>
+        <w:pStyle w:val="ListParagraph"/>
+        <w:numPr>
+          <w:ilvl w:val="0"/>
+          <w:numId w:val="3"/>
+        </w:numPr>
+        <w:spacing w:after="60" w:line="270"/>
+      </w:pPr>
+      <w:r>
+        <w:t xml:space="preserve"/>
+      </w:r>
+      <w:r>
+        <w:rPr>
+          <w:b/>
+          <w:bCs/>
+        </w:rPr>
+        <w:t xml:space="preserve">Comparación de métodos (barras):</w:t>
+      </w:r>
+      <w:r>
+        <w:t xml:space="preserve"> VaR y CVaR lado a lado por método, en USD. Ves de un golpe cuál es más conservador (barra más alta).</w:t>
+      </w:r>
+    </w:p>
+    <w:p>
+      <w:pPr>
+        <w:pStyle w:val="ListParagraph"/>
+        <w:numPr>
+          <w:ilvl w:val="0"/>
+          <w:numId w:val="3"/>
+        </w:numPr>
+        <w:spacing w:after="60" w:line="270"/>
+      </w:pPr>
+      <w:r>
+        <w:t xml:space="preserve"/>
+      </w:r>
+      <w:r>
+        <w:rPr>
+          <w:b/>
+          <w:bCs/>
+        </w:rPr>
+        <w:t xml:space="preserve">Atribución Brinson (barras por sector):</w:t>
+      </w:r>
+      <w:r>
+        <w:t xml:space="preserve"> barras apiladas que descomponen el exceso de cada sector en Asignación + Selección (+ Interacción en BHB). Barra hacia arriba = ese efecto sumó; hacia abajo = restó. El gráfico BHB-vs-BF muestra que el total es idéntico aunque el reparto difiera.</w:t>
+      </w:r>
+    </w:p>
+    <w:p>
+      <w:pPr>
         <w:pStyle w:val="Heading1"/>
       </w:pPr>
       <w:r>
@@ -11191,10 +12153,10 @@
     </w:p>
     <w:p>
       <w:pPr>
-        <w:pStyle w:val="Heading2"/>
-      </w:pPr>
-      <w:r>
-        <w:t xml:space="preserve">12.4 Métricas — leer un backtest</w:t>
+        <w:pStyle w:val="Heading3"/>
+      </w:pPr>
+      <w:r>
+        <w:t xml:space="preserve">Dos modos de ML en el tablero</w:t>
       </w:r>
     </w:p>
     <w:p>
@@ -11202,7 +12164,7 @@
         <w:spacing w:after="120" w:line="276"/>
       </w:pPr>
       <w:r>
-        <w:t xml:space="preserve">Reportar solo el retorno acumulado es engañoso. El set canónico:</w:t>
+        <w:t xml:space="preserve">Dentro de la estrategia Machine Learning podés elegir entre dos enfoques muy distintos:</w:t>
       </w:r>
     </w:p>
     <w:p>
@@ -11222,10 +12184,20 @@
           <w:b/>
           <w:bCs/>
         </w:rPr>
-        <w:t xml:space="preserve">CAGR:</w:t>
-      </w:r>
-      <w:r>
-        <w:t xml:space="preserve"> tasa anual compuesta — el retorno “limpio” del horizonte.</w:t>
+        <w:t xml:space="preserve">Timing (señal on/off):</w:t>
+      </w:r>
+      <w:r>
+        <w:t xml:space="preserve"> una sola señal 0/1 sobre la cartera ENTERA. El modelo decide si estar invertido (en los 5 activos a peso fijo) o pasar a cash. Responde solo al </w:t>
+      </w:r>
+      <w:r>
+        <w:rPr>
+          <w:b/>
+          <w:bCs/>
+        </w:rPr>
+        <w:t xml:space="preserve">“¿cuándo?”</w:t>
+      </w:r>
+      <w:r>
+        <w:t xml:space="preserve">. Es el de los scripts I y II.</w:t>
       </w:r>
     </w:p>
     <w:p>
@@ -11245,10 +12217,98 @@
           <w:b/>
           <w:bCs/>
         </w:rPr>
-        <w:t xml:space="preserve">Sharpe</w:t>
-      </w:r>
-      <w:r>
-        <w:t xml:space="preserve"> = (R̄−R_f)/σ — retorno por unidad de riesgo total. Bueno &gt;1, excelente &gt;2.</w:t>
+        <w:t xml:space="preserve">Pesos dinámicos (rotación cross-sectional):</w:t>
+      </w:r>
+      <w:r>
+        <w:t xml:space="preserve"> entrena </w:t>
+      </w:r>
+      <w:r>
+        <w:rPr>
+          <w:b/>
+          <w:bCs/>
+        </w:rPr>
+        <w:t xml:space="preserve">un modelo POR acción</w:t>
+      </w:r>
+      <w:r>
+        <w:t xml:space="preserve"> que predice P(esa acción sube). Cada día arma la cartera: selecciona las de buen pronóstico, las pondera por </w:t>
+      </w:r>
+      <w:r>
+        <w:rPr>
+          <w:b/>
+          <w:bCs/>
+        </w:rPr>
+        <w:t xml:space="preserve">convicción</w:t>
+      </w:r>
+      <w:r>
+        <w:t xml:space="preserve"> (cuanto más segura la suba, más peso, ∝ p−0,5), aplica un </w:t>
+      </w:r>
+      <w:r>
+        <w:rPr>
+          <w:b/>
+          <w:bCs/>
+        </w:rPr>
+        <w:t xml:space="preserve">cap por activo</w:t>
+      </w:r>
+      <w:r>
+        <w:t xml:space="preserve"> para no concentrar, y rota día a día; si nada sube, va a cash. Responde al </w:t>
+      </w:r>
+      <w:r>
+        <w:rPr>
+          <w:b/>
+          <w:bCs/>
+        </w:rPr>
+        <w:t xml:space="preserve">“¿qué tener y con qué peso?”</w:t>
+      </w:r>
+      <w:r>
+        <w:t xml:space="preserve"> — conecta la Clase 5 (ML) con la Clase 3 (asignación de carteras). El costo se cobra por </w:t>
+      </w:r>
+      <w:r>
+        <w:rPr>
+          <w:b/>
+          <w:bCs/>
+        </w:rPr>
+        <w:t xml:space="preserve">turnover</w:t>
+      </w:r>
+      <w:r>
+        <w:t xml:space="preserve"> real (cuánto se movió cada peso).</w:t>
+      </w:r>
+    </w:p>
+    <w:p>
+      <w:pPr>
+        <w:pBdr>
+          <w:left w:val="single" w:color="8B6F47" w:sz="18" w:space="8"/>
+        </w:pBdr>
+        <w:shd w:fill="FBF3E6" w:val="clear"/>
+        <w:spacing w:after="120" w:before="80" w:line="270"/>
+      </w:pPr>
+      <w:r>
+        <w:t xml:space="preserve">El modo de pesos es el más pesado: entrena (N acciones × N días) modelos. Por eso va detrás del botón </w:t>
+      </w:r>
+      <w:r>
+        <w:rPr>
+          <w:b/>
+          <w:bCs/>
+        </w:rPr>
+        <w:t xml:space="preserve">CORRER ROTACIÓN ML</w:t>
+      </w:r>
+      <w:r>
+        <w:t xml:space="preserve"> y, una vez corrido, queda cacheado.</w:t>
+      </w:r>
+    </w:p>
+    <w:p>
+      <w:pPr>
+        <w:pStyle w:val="Heading2"/>
+      </w:pPr>
+      <w:r>
+        <w:t xml:space="preserve">12.4 Métricas — leer un backtest</w:t>
+      </w:r>
+    </w:p>
+    <w:p>
+      <w:pPr>
+        <w:spacing w:after="120" w:line="276"/>
+      </w:pPr>
+      <w:r>
+        <w:t xml:space="preserve">Reportar solo el retorno acumulado es engañoso. El set canónico:</w:t>
       </w:r>
     </w:p>
     <w:p>
@@ -11268,10 +12328,10 @@
           <w:b/>
           <w:bCs/>
         </w:rPr>
-        <w:t xml:space="preserve">Sortino:</w:t>
-      </w:r>
-      <w:r>
-        <w:t xml:space="preserve"> como Sharpe, pero solo penaliza la volatilidad a la baja.</w:t>
+        <w:t xml:space="preserve">CAGR:</w:t>
+      </w:r>
+      <w:r>
+        <w:t xml:space="preserve"> tasa anual compuesta — el retorno “limpio” del horizonte.</w:t>
       </w:r>
     </w:p>
     <w:p>
@@ -11291,10 +12351,10 @@
           <w:b/>
           <w:bCs/>
         </w:rPr>
-        <w:t xml:space="preserve">Max Drawdown:</w:t>
-      </w:r>
-      <w:r>
-        <w:t xml:space="preserve"> peor caída desde un pico — lo que el cliente vio en pantalla.</w:t>
+        <w:t xml:space="preserve">Sharpe</w:t>
+      </w:r>
+      <w:r>
+        <w:t xml:space="preserve"> = (R̄−R_f)/σ — retorno por unidad de riesgo total. Bueno &gt;1, excelente &gt;2.</w:t>
       </w:r>
     </w:p>
     <w:p>
@@ -11314,10 +12374,10 @@
           <w:b/>
           <w:bCs/>
         </w:rPr>
-        <w:t xml:space="preserve">Calmar</w:t>
-      </w:r>
-      <w:r>
-        <w:t xml:space="preserve"> = CAGR/|MaxDD| — retorno por unidad de caída máxima.</w:t>
+        <w:t xml:space="preserve">Sortino:</w:t>
+      </w:r>
+      <w:r>
+        <w:t xml:space="preserve"> como Sharpe, pero solo penaliza la volatilidad a la baja.</w:t>
       </w:r>
     </w:p>
     <w:p>
@@ -11337,6 +12397,52 @@
           <w:b/>
           <w:bCs/>
         </w:rPr>
+        <w:t xml:space="preserve">Max Drawdown:</w:t>
+      </w:r>
+      <w:r>
+        <w:t xml:space="preserve"> peor caída desde un pico — lo que el cliente vio en pantalla.</w:t>
+      </w:r>
+    </w:p>
+    <w:p>
+      <w:pPr>
+        <w:pStyle w:val="ListParagraph"/>
+        <w:numPr>
+          <w:ilvl w:val="0"/>
+          <w:numId w:val="3"/>
+        </w:numPr>
+        <w:spacing w:after="60" w:line="270"/>
+      </w:pPr>
+      <w:r>
+        <w:t xml:space="preserve"/>
+      </w:r>
+      <w:r>
+        <w:rPr>
+          <w:b/>
+          <w:bCs/>
+        </w:rPr>
+        <w:t xml:space="preserve">Calmar</w:t>
+      </w:r>
+      <w:r>
+        <w:t xml:space="preserve"> = CAGR/|MaxDD| — retorno por unidad de caída máxima.</w:t>
+      </w:r>
+    </w:p>
+    <w:p>
+      <w:pPr>
+        <w:pStyle w:val="ListParagraph"/>
+        <w:numPr>
+          <w:ilvl w:val="0"/>
+          <w:numId w:val="3"/>
+        </w:numPr>
+        <w:spacing w:after="60" w:line="270"/>
+      </w:pPr>
+      <w:r>
+        <w:t xml:space="preserve"/>
+      </w:r>
+      <w:r>
+        <w:rPr>
+          <w:b/>
+          <w:bCs/>
+        </w:rPr>
         <w:t xml:space="preserve">Hit Ratio:</w:t>
       </w:r>
       <w:r>
@@ -11609,6 +12715,220 @@
       </w:r>
       <w:r>
         <w:t xml:space="preserve"> (alcista, bajista y lateral): una validada solo en un bull market no está validada. El equilibrio entre underfitting (modelo demasiado simple, no capta el patrón) y overfitting (memoriza el ruido) es lo que distingue una estrategia de un artefacto estadístico.</w:t>
+      </w:r>
+    </w:p>
+    <w:p>
+      <w:pPr>
+        <w:pStyle w:val="Heading2"/>
+      </w:pPr>
+      <w:r>
+        <w:t xml:space="preserve">12.8 Cómo leer los gráficos</w:t>
+      </w:r>
+    </w:p>
+    <w:p>
+      <w:pPr>
+        <w:spacing w:after="120" w:line="276"/>
+      </w:pPr>
+      <w:r>
+        <w:t xml:space="preserve">El período lo toma del selector global del sidebar; usá 5A o MÁX para que los backtests tengan suficientes operaciones.</w:t>
+      </w:r>
+    </w:p>
+    <w:p>
+      <w:pPr>
+        <w:pStyle w:val="ListParagraph"/>
+        <w:numPr>
+          <w:ilvl w:val="0"/>
+          <w:numId w:val="3"/>
+        </w:numPr>
+        <w:spacing w:after="60" w:line="270"/>
+      </w:pPr>
+      <w:r>
+        <w:t xml:space="preserve"/>
+      </w:r>
+      <w:r>
+        <w:rPr>
+          <w:b/>
+          <w:bCs/>
+        </w:rPr>
+        <w:t xml:space="preserve">Equity curve + drawdown (el par canónico):</w:t>
+      </w:r>
+      <w:r>
+        <w:t xml:space="preserve"> arriba, el rendimiento acumulado de la estrategia (naranja) vs. Buy &amp; Hold (celeste) — querés la línea naranja por encima. Los triángulos verdes/rojos marcan entradas/salidas. Abajo, el </w:t>
+      </w:r>
+      <w:r>
+        <w:rPr>
+          <w:b/>
+          <w:bCs/>
+        </w:rPr>
+        <w:t xml:space="preserve">drawdown underwater</w:t>
+      </w:r>
+      <w:r>
+        <w:t xml:space="preserve">: cada pozo es una caída desde el máximo; el más profundo es el Max DD. Una estrategia que “sube en escalera” con pozos chicos es mejor que una con el mismo retorno pero pozos enormes.</w:t>
+      </w:r>
+    </w:p>
+    <w:p>
+      <w:pPr>
+        <w:pStyle w:val="ListParagraph"/>
+        <w:numPr>
+          <w:ilvl w:val="0"/>
+          <w:numId w:val="3"/>
+        </w:numPr>
+        <w:spacing w:after="60" w:line="270"/>
+      </w:pPr>
+      <w:r>
+        <w:t xml:space="preserve"/>
+      </w:r>
+      <w:r>
+        <w:rPr>
+          <w:b/>
+          <w:bCs/>
+        </w:rPr>
+        <w:t xml:space="preserve">Panel del indicador (RSI / Momentum):</w:t>
+      </w:r>
+      <w:r>
+        <w:t xml:space="preserve"> debajo de la equity, muestra la señal que disparó las operaciones, con sus umbrales — para ver POR QUÉ entró o salió en cada punto.</w:t>
+      </w:r>
+    </w:p>
+    <w:p>
+      <w:pPr>
+        <w:pStyle w:val="ListParagraph"/>
+        <w:numPr>
+          <w:ilvl w:val="0"/>
+          <w:numId w:val="3"/>
+        </w:numPr>
+        <w:spacing w:after="60" w:line="270"/>
+      </w:pPr>
+      <w:r>
+        <w:t xml:space="preserve"/>
+      </w:r>
+      <w:r>
+        <w:rPr>
+          <w:b/>
+          <w:bCs/>
+        </w:rPr>
+        <w:t xml:space="preserve">Histograma Monte Carlo:</w:t>
+      </w:r>
+      <w:r>
+        <w:t xml:space="preserve"> simula miles de trayectorias posibles del rendimiento final. La línea verde es el resultado real; la </w:t>
+      </w:r>
+      <w:r>
+        <w:rPr>
+          <w:b/>
+          <w:bCs/>
+        </w:rPr>
+        <w:t xml:space="preserve">naranja el VaR 5%</w:t>
+      </w:r>
+      <w:r>
+        <w:t xml:space="preserve"> y la </w:t>
+      </w:r>
+      <w:r>
+        <w:rPr>
+          <w:b/>
+          <w:bCs/>
+        </w:rPr>
+        <w:t xml:space="preserve">roja el CVaR 5%</w:t>
+      </w:r>
+      <w:r>
+        <w:t xml:space="preserve"> (los peores escenarios). Si el real cae en la cola izquierda, tuviste suerte mala; si está a la derecha del grueso, suerte buena. Da una idea del rango de resultados, no solo del que tocó.</w:t>
+      </w:r>
+    </w:p>
+    <w:p>
+      <w:pPr>
+        <w:pStyle w:val="ListParagraph"/>
+        <w:numPr>
+          <w:ilvl w:val="0"/>
+          <w:numId w:val="3"/>
+        </w:numPr>
+        <w:spacing w:after="60" w:line="270"/>
+      </w:pPr>
+      <w:r>
+        <w:t xml:space="preserve"/>
+      </w:r>
+      <w:r>
+        <w:rPr>
+          <w:b/>
+          <w:bCs/>
+        </w:rPr>
+        <w:t xml:space="preserve">Rebalanceo — portfolio drift:</w:t>
+      </w:r>
+      <w:r>
+        <w:t xml:space="preserve"> área apilada de los pesos SIN rebalancear (Buy &amp; Hold). Mostrás cómo el ganador va “comiéndose” la cartera con el tiempo: ese es el motivo de rebalancear.</w:t>
+      </w:r>
+    </w:p>
+    <w:p>
+      <w:pPr>
+        <w:pStyle w:val="ListParagraph"/>
+        <w:numPr>
+          <w:ilvl w:val="0"/>
+          <w:numId w:val="3"/>
+        </w:numPr>
+        <w:spacing w:after="60" w:line="270"/>
+      </w:pPr>
+      <w:r>
+        <w:t xml:space="preserve"/>
+      </w:r>
+      <w:r>
+        <w:rPr>
+          <w:b/>
+          <w:bCs/>
+        </w:rPr>
+        <w:t xml:space="preserve">ML timing — matriz de confusión:</w:t>
+      </w:r>
+      <w:r>
+        <w:t xml:space="preserve"> grilla 2×2 de aciertos/errores del modelo (predijo sube/baja vs. lo que pasó). La diagonal son aciertos. Al lado, la </w:t>
+      </w:r>
+      <w:r>
+        <w:rPr>
+          <w:b/>
+          <w:bCs/>
+        </w:rPr>
+        <w:t xml:space="preserve">importancia de features</w:t>
+      </w:r>
+      <w:r>
+        <w:t xml:space="preserve">: qué activo pesó más en las decisiones.</w:t>
+      </w:r>
+    </w:p>
+    <w:p>
+      <w:pPr>
+        <w:pStyle w:val="ListParagraph"/>
+        <w:numPr>
+          <w:ilvl w:val="0"/>
+          <w:numId w:val="3"/>
+        </w:numPr>
+        <w:spacing w:after="60" w:line="270"/>
+      </w:pPr>
+      <w:r>
+        <w:t xml:space="preserve"/>
+      </w:r>
+      <w:r>
+        <w:rPr>
+          <w:b/>
+          <w:bCs/>
+        </w:rPr>
+        <w:t xml:space="preserve">ML pesos — composición de la cartera:</w:t>
+      </w:r>
+      <w:r>
+        <w:t xml:space="preserve"> área apilada donde cada color es una acción y su grosor es el peso ese día; la línea punteada es el </w:t>
+      </w:r>
+      <w:r>
+        <w:rPr>
+          <w:b/>
+          <w:bCs/>
+        </w:rPr>
+        <w:t xml:space="preserve">% invertido</w:t>
+      </w:r>
+      <w:r>
+        <w:t xml:space="preserve"> (lo que falta hasta 100% es cash). Acá ves literalmente la </w:t>
+      </w:r>
+      <w:r>
+        <w:rPr>
+          <w:b/>
+          <w:bCs/>
+        </w:rPr>
+        <w:t xml:space="preserve">rotación</w:t>
+      </w:r>
+      <w:r>
+        <w:t xml:space="preserve">: cómo entran, salen y cambian de tamaño las posiciones día a día según el modelo.</w:t>
       </w:r>
     </w:p>
     <w:p>

</xml_diff>

<commit_message>
Gráficos más anchos: full-width en Technical + menos padding lateral + más altura
</commit_message>
<xml_diff>
--- a/Manual_ACI_Terminal.docx
+++ b/Manual_ACI_Terminal.docx
@@ -1439,6 +1439,38 @@
     </w:p>
     <w:p>
       <w:pPr>
+        <w:pBdr>
+          <w:left w:val="single" w:color="1F3A5F" w:sz="18" w:space="8"/>
+        </w:pBdr>
+        <w:shd w:fill="EAF0F6" w:val="clear"/>
+        <w:spacing w:after="120" w:before="80" w:line="270"/>
+      </w:pPr>
+      <w:r>
+        <w:t xml:space="preserve"/>
+      </w:r>
+      <w:r>
+        <w:rPr>
+          <w:b/>
+          <w:bCs/>
+        </w:rPr>
+        <w:t xml:space="preserve">Memoria entre sesiones.</w:t>
+      </w:r>
+      <w:r>
+        <w:t xml:space="preserve"> El dashboard </w:t>
+      </w:r>
+      <w:r>
+        <w:rPr>
+          <w:b/>
+          <w:bCs/>
+        </w:rPr>
+        <w:t xml:space="preserve">recuerda tu última watchlist</w:t>
+      </w:r>
+      <w:r>
+        <w:t xml:space="preserve">: se guarda en un archivo local (.watchlist.json) y al reabrirlo aparece la selección que dejaste, no un default fijo. Los tickers iniciales (AAPL, MSFT, GOOGL, AMZN, TSLA) son solo la semilla del primer arranque. (En local funciona siempre; en Streamlit Cloud el disco es efímero, así que ahí la memoria es best-effort.)</w:t>
+      </w:r>
+    </w:p>
+    <w:p>
+      <w:pPr>
         <w:pStyle w:val="Heading3"/>
       </w:pPr>
       <w:r>
@@ -1509,6 +1541,44 @@
       </w:r>
       <w:r>
         <w:t xml:space="preserve"> podés fijar fechas exactas y elegir la granularidad de las velas (1m … 1wk).</w:t>
+      </w:r>
+    </w:p>
+    <w:p>
+      <w:pPr>
+        <w:spacing w:after="120" w:line="276"/>
+      </w:pPr>
+      <w:r>
+        <w:t xml:space="preserve"/>
+      </w:r>
+      <w:r>
+        <w:rPr>
+          <w:b/>
+          <w:bCs/>
+        </w:rPr>
+        <w:t xml:space="preserve">Excepción — Strategy Lab:</w:t>
+      </w:r>
+      <w:r>
+        <w:t xml:space="preserve"> como el backtesting tiene necesidades temporales distintas (historia larga y multi-régimen), ese tab puede </w:t>
+      </w:r>
+      <w:r>
+        <w:rPr>
+          <w:b/>
+          <w:bCs/>
+        </w:rPr>
+        <w:t xml:space="preserve">usar su propia ventana</w:t>
+      </w:r>
+      <w:r>
+        <w:t xml:space="preserve"> y un corte in-sample/out-of-sample propio, sin atarse al período global. Ver sección 12.7. </w:t>
+      </w:r>
+      <w:r>
+        <w:rPr>
+          <w:b/>
+          <w:bCs/>
+        </w:rPr>
+        <w:t xml:space="preserve">Fundamental</w:t>
+      </w:r>
+      <w:r>
+        <w:t xml:space="preserve"> no usa el período: sus datos son “foto” (TTM / último reporte).</w:t>
       </w:r>
     </w:p>
     <w:p>
@@ -12683,6 +12753,68 @@
     </w:p>
     <w:p>
       <w:pPr>
+        <w:pBdr>
+          <w:left w:val="single" w:color="1F3A5F" w:sz="18" w:space="8"/>
+        </w:pBdr>
+        <w:shd w:fill="EAF0F6" w:val="clear"/>
+        <w:spacing w:after="120" w:before="80" w:line="270"/>
+      </w:pPr>
+      <w:r>
+        <w:t xml:space="preserve"/>
+      </w:r>
+      <w:r>
+        <w:rPr>
+          <w:b/>
+          <w:bCs/>
+        </w:rPr>
+        <w:t xml:space="preserve">En el tablero (avanzado).</w:t>
+      </w:r>
+      <w:r>
+        <w:t xml:space="preserve"> El Strategy Lab trae un desplegable </w:t>
+      </w:r>
+      <w:r>
+        <w:rPr>
+          <w:b/>
+          <w:bCs/>
+        </w:rPr>
+        <w:t xml:space="preserve">“Ventana de backtest e in-sample/out-of-sample”</w:t>
+      </w:r>
+      <w:r>
+        <w:t xml:space="preserve"> con: (1) un check para </w:t>
+      </w:r>
+      <w:r>
+        <w:rPr>
+          <w:b/>
+          <w:bCs/>
+        </w:rPr>
+        <w:t xml:space="preserve">usar una ventana propia</w:t>
+      </w:r>
+      <w:r>
+        <w:t xml:space="preserve"> (historia larga y multi-régimen) en vez del período global del sidebar; y (2) un </w:t>
+      </w:r>
+      <w:r>
+        <w:rPr>
+          <w:b/>
+          <w:bCs/>
+        </w:rPr>
+        <w:t xml:space="preserve">slider de corte in-sample %</w:t>
+      </w:r>
+      <w:r>
+        <w:t xml:space="preserve"> (50–90, default 80) que vos controlás. Ese corte aplica a Trend, RSI, Momentum y Rebalanceo; las estrategias de </w:t>
+      </w:r>
+      <w:r>
+        <w:rPr>
+          <w:b/>
+          <w:bCs/>
+        </w:rPr>
+        <w:t xml:space="preserve">Machine Learning usan walk-forward</w:t>
+      </w:r>
+      <w:r>
+        <w:t xml:space="preserve"> y no ese corte único.</w:t>
+      </w:r>
+    </w:p>
+    <w:p>
+      <w:pPr>
         <w:spacing w:after="120" w:line="276"/>
       </w:pPr>
       <w:r>
@@ -12730,7 +12862,7 @@
         <w:spacing w:after="120" w:line="276"/>
       </w:pPr>
       <w:r>
-        <w:t xml:space="preserve">El período lo toma del selector global del sidebar; usá 5A o MÁX para que los backtests tengan suficientes operaciones.</w:t>
+        <w:t xml:space="preserve">Por defecto el período sale del selector global del sidebar (usá 5A o MÁX para tener suficientes operaciones), o de la ventana propia del backtest si la activaste (ver 12.7).</w:t>
       </w:r>
     </w:p>
     <w:p>

</xml_diff>